<commit_message>
Close pre-SaaS decisions DEC-02 through DEC-07 for ComJuntas
Add persona, plans, trial policy, Stripe gateway choice, and F1 wireframes. Revise Pro plan to include community and courses; update roadmap checklist and Word export.

Co-authored-by: Cursor <cursoragent@cursor.com>
</commit_message>
<xml_diff>
--- a/docs/saas/ROADMAP-EXECUCAO.docx
+++ b/docs/saas/ROADMAP-EXECUCAO.docx
@@ -728,7 +728,7 @@
         <w:rPr>
           <w:b/>
         </w:rPr>
-        <w:t>0/8 concluídos</w:t>
+        <w:t>5/8 concluídos</w:t>
       </w:r>
     </w:p>
     <w:p>
@@ -883,7 +883,7 @@
           </w:tcPr>
           <w:p>
             <w:r>
-              <w:t>⬜ A fazer</w:t>
+              <w:t>✅ Concluído</w:t>
             </w:r>
           </w:p>
         </w:tc>
@@ -921,7 +921,7 @@
     </w:p>
     <w:p>
       <w:r>
-        <w:t>Quem paga primeiro: UGC beauty iniciante, micro creator 5–10k, ou 10k+.</w:t>
+        <w:t>Beauty influencer BR (UGC + creator tradicional). Três faixas: A 500–3k, B 3k–10k (prioridade launch), C 10k+.</w:t>
       </w:r>
     </w:p>
     <w:p>
@@ -947,12 +947,12 @@
     </w:p>
     <w:p>
       <w:r>
-        <w:t>☐ 1 persona primária escolhida</w:t>
-      </w:r>
-    </w:p>
-    <w:p>
-      <w:r>
-        <w:t>☐ Registrada no doc de produto</w:t>
+        <w:t>☑ 1 persona primária escolhida</w:t>
+      </w:r>
+    </w:p>
+    <w:p>
+      <w:r>
+        <w:t>☑ Registrada no doc de produto</w:t>
       </w:r>
     </w:p>
     <w:p>
@@ -995,7 +995,7 @@
           </w:tcPr>
           <w:p>
             <w:r>
-              <w:t>⬜ A fazer</w:t>
+              <w:t>✅ Concluído</w:t>
             </w:r>
           </w:p>
         </w:tc>
@@ -1033,7 +1033,7 @@
     </w:p>
     <w:p>
       <w:r>
-        <w:t>Quantos planos no go-live (recomendado Starter + Pro) e preços de referência.</w:t>
+        <w:t>Start R$69 (só ferramenta) + Pro R$129 (hero: + comunidade + cursos). Plano Plus/intermediário TBD depois.</w:t>
       </w:r>
     </w:p>
     <w:p>
@@ -1059,12 +1059,12 @@
     </w:p>
     <w:p>
       <w:r>
-        <w:t>☐ Planos e limites por plano definidos</w:t>
-      </w:r>
-    </w:p>
-    <w:p>
-      <w:r>
-        <w:t>☐ Preços de referência validados</w:t>
+        <w:t>☑ Planos e limites por plano definidos</w:t>
+      </w:r>
+    </w:p>
+    <w:p>
+      <w:r>
+        <w:t>☑ Preços de referência validados</w:t>
       </w:r>
     </w:p>
     <w:p>
@@ -1107,7 +1107,7 @@
           </w:tcPr>
           <w:p>
             <w:r>
-              <w:t>⬜ A fazer</w:t>
+              <w:t>✅ Concluído</w:t>
             </w:r>
           </w:p>
         </w:tc>
@@ -1145,7 +1145,7 @@
     </w:p>
     <w:p>
       <w:r>
-        <w:t>Trial 7 dias vs pagamento direto vs freemium limitado.</w:t>
+        <w:t>Trial 7 dias com limitações (Start + Pro). Cartão obrigatório. Pro+ sem trial. Ver TRIAL-POLICY.md.</w:t>
       </w:r>
     </w:p>
     <w:p>
@@ -1171,12 +1171,12 @@
     </w:p>
     <w:p>
       <w:r>
-        <w:t>☐ Decisão única registrada</w:t>
-      </w:r>
-    </w:p>
-    <w:p>
-      <w:r>
-        <w:t>☐ Impacto no billing descrito</w:t>
+        <w:t>☑ Decisão única registrada</w:t>
+      </w:r>
+    </w:p>
+    <w:p>
+      <w:r>
+        <w:t>☑ Impacto no billing descrito</w:t>
       </w:r>
     </w:p>
     <w:p>
@@ -1219,7 +1219,7 @@
           </w:tcPr>
           <w:p>
             <w:r>
-              <w:t>⬜ A fazer</w:t>
+              <w:t>✅ Concluído</w:t>
             </w:r>
           </w:p>
         </w:tc>
@@ -1257,7 +1257,7 @@
     </w:p>
     <w:p>
       <w:r>
-        <w:t>Stripe, Mercado Pago ou ambos para assinatura BR.</w:t>
+        <w:t>Stripe principal F1 (assinatura + trial + cursos). Mercado Pago PIX opcional F2 para curso avulso. Ver PAYMENT-GATEWAY.md.</w:t>
       </w:r>
     </w:p>
     <w:p>
@@ -1283,12 +1283,12 @@
     </w:p>
     <w:p>
       <w:r>
-        <w:t>☐ Conta sandbox/teste acessível</w:t>
-      </w:r>
-    </w:p>
-    <w:p>
-      <w:r>
-        <w:t>☐ Documentado em docs/saas/</w:t>
+        <w:t>☑ Decisão documentada em docs/saas/PAYMENT-GATEWAY.md</w:t>
+      </w:r>
+    </w:p>
+    <w:p>
+      <w:r>
+        <w:t>☐ Conta Stripe teste criada antes de F1-08 (checklist no doc)</w:t>
       </w:r>
     </w:p>
     <w:p>
@@ -1443,7 +1443,7 @@
           </w:tcPr>
           <w:p>
             <w:r>
-              <w:t>⬜ A fazer</w:t>
+              <w:t>✅ Concluído</w:t>
             </w:r>
           </w:p>
         </w:tc>
@@ -1481,7 +1481,7 @@
     </w:p>
     <w:p>
       <w:r>
-        <w:t>Esboço das 5 telas usuária + 2 admin para Core SaaS.</w:t>
+        <w:t>Wireframes textuais: onboarding (Stripe+IG), 5 telas app, 2 admin.</w:t>
       </w:r>
     </w:p>
     <w:p>
@@ -1507,12 +1507,12 @@
     </w:p>
     <w:p>
       <w:r>
-        <w:t>☐ Onboarding, dashboard, media kit, portfólio, conta mapeados</w:t>
-      </w:r>
-    </w:p>
-    <w:p>
-      <w:r>
-        <w:t>☐ Admin: lista usuárias + detalhe mapeados</w:t>
+        <w:t>☑ Onboarding, dashboard, media kit, portfólio, conta mapeados</w:t>
+      </w:r>
+    </w:p>
+    <w:p>
+      <w:r>
+        <w:t>☑ Admin: lista usuárias + detalhe mapeados</w:t>
       </w:r>
     </w:p>
     <w:p>

</xml_diff>